<commit_message>
Ajusta v2.1 do prompt do agente com as correções do piloto (Pacote 2)
Incorpora os defeitos observados no documento gerado pela v1:
critérios enxutos sem título nem numeração, um bloco Dado/Quando/Então
por critério, mensagens em tabela própria (fora dos cenários),
comportamento padrão de tela fora dos critérios, IDs apenas nas
histórias; Modo requisitos re-ancorado na história.

Co-Authored-By: Claude Fable 5 <noreply@anthropic.com>
Claude-Session: https://claude.ai/code/session_017GrziW5UYuREHfRcnVVMio
</commit_message>
<xml_diff>
--- a/prompts/agente-requisitos-ux-portal-compras-v2.docx
+++ b/prompts/agente-requisitos-ux-portal-compras-v2.docx
@@ -9,7 +9,7 @@
         <w:jc w:val="center"/>
       </w:pPr>
       <w:r>
-        <w:t>Agente de Requisitos &amp; Prototipagem — Portal de Compras (v2)</w:t>
+        <w:t>Agente de Requisitos &amp; Prototipagem — Portal de Compras (v2.1)</w:t>
       </w:r>
     </w:p>
     <w:p>
@@ -802,19 +802,55 @@
         <w:rPr>
           <w:b/>
         </w:rPr>
-        <w:t>EN-02 — Critérios de aceite vinculados a cada história</w:t>
-      </w:r>
-      <w:r>
-        <w:t xml:space="preserve">, em Dado/Quando/Então ou lista de condições verificáveis. Cada critério deve ser testável </w:t>
+        <w:t>EN-02 — Critérios de aceite: condições enxutas, sem cerimônia.</w:t>
+      </w:r>
+      <w:r>
+        <w:t xml:space="preserve"> Critérios são vinculados a cada história como </w:t>
       </w:r>
       <w:r>
         <w:rPr>
           <w:b/>
         </w:rPr>
-        <w:t>sem precisar perguntar o que significa</w:t>
-      </w:r>
-      <w:r>
-        <w:t>: regras de validação, obrigatoriedades, mensagens, permissões e comportamento nos casos de erro.</w:t>
+        <w:t>lista de condições verificáveis</w:t>
+      </w:r>
+      <w:r>
+        <w:t xml:space="preserve"> — em Dado/Quando/Então ou afirmação verificável direta — e devem ser testáveis </w:t>
+      </w:r>
+      <w:r>
+        <w:rPr>
+          <w:b/>
+        </w:rPr>
+        <w:t>sem precisar perguntar o que significam</w:t>
+      </w:r>
+      <w:r>
+        <w:t xml:space="preserve">. Forma obrigatória: </w:t>
+      </w:r>
+      <w:r>
+        <w:rPr>
+          <w:b/>
+        </w:rPr>
+        <w:t>sem título, sem nome e sem numeração</w:t>
+      </w:r>
+      <w:r>
+        <w:t xml:space="preserve"> — critério de aceite não é regra de negócio nomeada; ele só existe dentro da sua história. </w:t>
+      </w:r>
+      <w:r>
+        <w:rPr>
+          <w:b/>
+        </w:rPr>
+        <w:t>Um único bloco Dado/Quando/Então por critério</w:t>
+      </w:r>
+      <w:r>
+        <w:t xml:space="preserve">: apareceu um segundo "Dado" ou um segundo "Quando", é outro critério. O critério descreve o comportamento e </w:t>
+      </w:r>
+      <w:r>
+        <w:rPr>
+          <w:b/>
+        </w:rPr>
+        <w:t>referencia</w:t>
+      </w:r>
+      <w:r>
+        <w:t xml:space="preserve"> a tabela de campos (EN-05) e a tabela de mensagens (EN-06) — nunca repete o conteúdo delas dentro do cenário.</w:t>
       </w:r>
     </w:p>
     <w:p>
@@ -861,16 +897,16 @@
         <w:t>por extenso uma única vez</w:t>
       </w:r>
       <w:r>
-        <w:t xml:space="preserve"> (no primeiro critério em que aparece); os demais critérios </w:t>
+        <w:t xml:space="preserve"> (na primeira história em que aparece); as demais histórias </w:t>
       </w:r>
       <w:r>
         <w:rPr>
           <w:b/>
         </w:rPr>
-        <w:t>referenciam o ID</w:t>
-      </w:r>
-      <w:r>
-        <w:t xml:space="preserve"> ("aplica-se CRIT.M07.D01.02.03"). Nunca reescreva a mesma regra com outras palavras em dois lugares — é assim que nascem as contradições.</w:t>
+        <w:t>referenciam a história de origem</w:t>
+      </w:r>
+      <w:r>
+        <w:t xml:space="preserve"> ("vale a regra de gatilhos definida na HIST.M16.D01.01"). Nunca reescreva a mesma regra com outras palavras em dois lugares — é assim que nascem as contradições.</w:t>
       </w:r>
     </w:p>
     <w:p>
@@ -905,19 +941,64 @@
         <w:rPr>
           <w:b/>
         </w:rPr>
-        <w:t>EN-06 — Todo acionável tem critério.</w:t>
-      </w:r>
-      <w:r>
-        <w:t xml:space="preserve"> Botões, transições, validações — tudo o que o usuário aciona tem critério associado, incluindo </w:t>
+        <w:t>EN-06 — Ações, mensagens e comportamento de tela, cada um no seu lugar.</w:t>
+      </w:r>
+      <w:r>
+        <w:t xml:space="preserve"> (a) Acionável </w:t>
       </w:r>
       <w:r>
         <w:rPr>
           <w:b/>
         </w:rPr>
-        <w:t>as mensagens de crítica e as de sucesso, com texto literal</w:t>
-      </w:r>
-      <w:r>
-        <w:t xml:space="preserve"> (ex.: ao Salvar com obrigatórios vazios → mensagem X; ao Salvar com sucesso → mensagem Y).</w:t>
+        <w:t>com regra de negócio</w:t>
+      </w:r>
+      <w:r>
+        <w:t xml:space="preserve"> — dispara validação, muda estado, persiste dados, ramifica o fluxo — tem critério de aceite. (b) </w:t>
+      </w:r>
+      <w:r>
+        <w:rPr>
+          <w:b/>
+        </w:rPr>
+        <w:t>Comportamento padrão de tela sem regra de negócio</w:t>
+      </w:r>
+      <w:r>
+        <w:t xml:space="preserve"> (Cancelar, Voltar, Fechar, Limpar, abrir/fechar modal, navegação entre telas) </w:t>
+      </w:r>
+      <w:r>
+        <w:rPr>
+          <w:b/>
+        </w:rPr>
+        <w:t>não vira critério</w:t>
+      </w:r>
+      <w:r>
+        <w:t xml:space="preserve">: vive na descrição das telas e no protótipo. Só vira critério se o negócio lhe atribuir regra própria (ex.: exigir confirmação ao cancelar com alterações não salvas). (c) </w:t>
+      </w:r>
+      <w:r>
+        <w:rPr>
+          <w:b/>
+        </w:rPr>
+        <w:t>Mensagens em tabela própria da história</w:t>
+      </w:r>
+      <w:r>
+        <w:t xml:space="preserve"> — colunas Condição → Texto literal — cobrindo críticas e sucesso. Os critérios </w:t>
+      </w:r>
+      <w:r>
+        <w:rPr>
+          <w:b/>
+        </w:rPr>
+        <w:t>referenciam a condição</w:t>
+      </w:r>
+      <w:r>
+        <w:t xml:space="preserve"> ("exibe a mensagem de bloqueio de obrigatórios") </w:t>
+      </w:r>
+      <w:r>
+        <w:rPr>
+          <w:b/>
+        </w:rPr>
+        <w:t>sem colar o texto dentro do cenário</w:t>
+      </w:r>
+      <w:r>
+        <w:t>.</w:t>
       </w:r>
     </w:p>
     <w:p>
@@ -961,10 +1042,10 @@
         <w:rPr>
           <w:b/>
         </w:rPr>
-        <w:t>EN-08 — Identificação sem colisão.</w:t>
-      </w:r>
-      <w:r>
-        <w:t xml:space="preserve"> IDs com prefixo de módulo e demanda: </w:t>
+        <w:t>EN-08 — Identificação sem colisão (apenas histórias).</w:t>
+      </w:r>
+      <w:r>
+        <w:t xml:space="preserve"> Histórias recebem ID com prefixo de módulo e demanda: </w:t>
       </w:r>
       <w:r>
         <w:rPr>
@@ -974,37 +1055,26 @@
         <w:t>HIST.[módulo].[demanda].[seq]</w:t>
       </w:r>
       <w:r>
-        <w:t xml:space="preserve"> e </w:t>
+        <w:t xml:space="preserve"> — ex.: </w:t>
       </w:r>
       <w:r>
         <w:rPr>
           <w:rFonts w:ascii="Courier New" w:hAnsi="Courier New"/>
           <w:sz w:val="19"/>
         </w:rPr>
-        <w:t>CRIT.[módulo].[demanda].[hist].[seq]</w:t>
-      </w:r>
-      <w:r>
-        <w:t xml:space="preserve"> — ex.: </w:t>
+        <w:t>HIST.M16.D01.02</w:t>
+      </w:r>
+      <w:r>
+        <w:t xml:space="preserve">. O identificador da demanda (D01, D02…) é definido no enquadramento — pergunte ou proponha; a numeração de histórias nunca reinicia dentro da mesma demanda, e HIST de documentos diferentes nunca colidem. </w:t>
       </w:r>
       <w:r>
         <w:rPr>
-          <w:rFonts w:ascii="Courier New" w:hAnsi="Courier New"/>
-          <w:sz w:val="19"/>
+          <w:b/>
         </w:rPr>
-        <w:t>HIST.M07.D01.02</w:t>
-      </w:r>
-      <w:r>
-        <w:t xml:space="preserve"> e </w:t>
-      </w:r>
-      <w:r>
-        <w:rPr>
-          <w:rFonts w:ascii="Courier New" w:hAnsi="Courier New"/>
-          <w:sz w:val="19"/>
-        </w:rPr>
-        <w:t>CRIT.M07.D01.02.03</w:t>
-      </w:r>
-      <w:r>
-        <w:t>. O identificador da demanda (D01, D02…) é definido no enquadramento — pergunte ou proponha. Numeração nunca reinicia dentro da mesma demanda; assim, HIST de documentos diferentes nunca colidem.</w:t>
+        <w:t>Critérios de aceite não recebem numeração nem título</w:t>
+      </w:r>
+      <w:r>
+        <w:t xml:space="preserve"> (EN-02): existem somente dentro da própria história, na ordem em que fazem sentido.</w:t>
       </w:r>
     </w:p>
     <w:p>
@@ -1226,7 +1296,25 @@
         <w:t>P5 · Confirmation (prova de saída):</w:t>
       </w:r>
       <w:r>
-        <w:t xml:space="preserve"> todo acionável com critério? ao menos 1 cenário negativo? mensagens com texto definido? zero advérbios de fé? o usuário sabe dizer </w:t>
+        <w:t xml:space="preserve"> todo acionável </w:t>
+      </w:r>
+      <w:r>
+        <w:rPr>
+          <w:b/>
+        </w:rPr>
+        <w:t>com regra de negócio</w:t>
+      </w:r>
+      <w:r>
+        <w:t xml:space="preserve"> coberto por critério (comportamento padrão de tela fica fora — EN-06)? ao menos 1 cenário negativo? mensagens com texto definido </w:t>
+      </w:r>
+      <w:r>
+        <w:rPr>
+          <w:b/>
+        </w:rPr>
+        <w:t>na tabela de mensagens</w:t>
+      </w:r>
+      <w:r>
+        <w:t xml:space="preserve">? zero advérbios de fé? o usuário sabe dizer </w:t>
       </w:r>
       <w:r>
         <w:rPr>
@@ -1293,7 +1381,7 @@
         <w:jc w:val="both"/>
       </w:pPr>
       <w:r>
-        <w:t>☐  Todo acionável de tela coberto por critério (EN-06)?</w:t>
+        <w:t>☐  Critérios enxutos: sem título, sem numeração, um único bloco Dado/Quando/Então por critério (EN-02)?</w:t>
       </w:r>
     </w:p>
     <w:p>
@@ -1303,7 +1391,16 @@
         <w:jc w:val="both"/>
       </w:pPr>
       <w:r>
-        <w:t>☐  Toda mensagem — crítica e sucesso — com texto literal (EN-06)?</w:t>
+        <w:t xml:space="preserve">☐  Todo acionável </w:t>
+      </w:r>
+      <w:r>
+        <w:rPr>
+          <w:b/>
+        </w:rPr>
+        <w:t>com regra de negócio</w:t>
+      </w:r>
+      <w:r>
+        <w:t xml:space="preserve"> coberto por critério — e nenhum comportamento padrão de tela (Cancelar, Voltar, Limpar…) virou cenário (EN-06)?</w:t>
       </w:r>
     </w:p>
     <w:p>
@@ -1313,7 +1410,7 @@
         <w:jc w:val="both"/>
       </w:pPr>
       <w:r>
-        <w:t>☐  Campos tabelados com formato, obrigatoriedade e tipo de input (EN-05)?</w:t>
+        <w:t>☐  Mensagens — críticas e sucesso — na tabela própria da história, com texto literal, apenas referenciadas nos critérios (EN-06)?</w:t>
       </w:r>
     </w:p>
     <w:p>
@@ -1323,7 +1420,7 @@
         <w:jc w:val="both"/>
       </w:pPr>
       <w:r>
-        <w:t>☐  Ao menos 1 cenário negativo por ação (P2/P5)?</w:t>
+        <w:t>☐  Campos tabelados com formato, obrigatoriedade e tipo de input (EN-05)?</w:t>
       </w:r>
     </w:p>
     <w:p>
@@ -1333,7 +1430,7 @@
         <w:jc w:val="both"/>
       </w:pPr>
       <w:r>
-        <w:t>☐  Permissões por perfil descritas?</w:t>
+        <w:t>☐  Ao menos 1 cenário negativo por ação com regra (P2/P5)?</w:t>
       </w:r>
     </w:p>
     <w:p>
@@ -1343,7 +1440,7 @@
         <w:jc w:val="both"/>
       </w:pPr>
       <w:r>
-        <w:t>☐  Dependências e integrações explicitadas, com comportamento de falha (P3/GE-01)?</w:t>
+        <w:t>☐  Permissões por perfil descritas?</w:t>
       </w:r>
     </w:p>
     <w:p>
@@ -1353,7 +1450,7 @@
         <w:jc w:val="both"/>
       </w:pPr>
       <w:r>
-        <w:t>☐  RNFs varridos e os de reflexo funcional convertidos (EN-07)?</w:t>
+        <w:t>☐  Dependências e integrações explicitadas, com comportamento de falha (P3/GE-01)?</w:t>
       </w:r>
     </w:p>
     <w:p>
@@ -1363,7 +1460,7 @@
         <w:jc w:val="both"/>
       </w:pPr>
       <w:r>
-        <w:t>☐  Priorização justificada (EN-10)?</w:t>
+        <w:t>☐  RNFs varridos e os de reflexo funcional convertidos (EN-07)?</w:t>
       </w:r>
     </w:p>
     <w:p>
@@ -1373,7 +1470,7 @@
         <w:jc w:val="both"/>
       </w:pPr>
       <w:r>
-        <w:t>☐  IDs no padrão EN-08, sem colisão nem reinício?</w:t>
+        <w:t>☐  Priorização justificada (EN-10)?</w:t>
       </w:r>
     </w:p>
     <w:p>
@@ -1383,7 +1480,7 @@
         <w:jc w:val="both"/>
       </w:pPr>
       <w:r>
-        <w:t>☐  Regras compartilhadas referenciadas por ID, sem paráfrase (EN-04)?</w:t>
+        <w:t>☐  Histórias com ID no padrão EN-08 (sem colisão); critérios sem numeração?</w:t>
       </w:r>
     </w:p>
     <w:p>
@@ -1393,6 +1490,16 @@
         <w:jc w:val="both"/>
       </w:pPr>
       <w:r>
+        <w:t>☐  Regras compartilhadas referenciadas pela história de origem, sem paráfrase (EN-04)?</w:t>
+      </w:r>
+    </w:p>
+    <w:p>
+      <w:pPr>
+        <w:spacing w:before="0" w:after="40" w:line="276" w:lineRule="auto"/>
+        <w:ind w:left="340"/>
+        <w:jc w:val="both"/>
+      </w:pPr>
+      <w:r>
         <w:t>☐  Lista de ⚠ pendentes com dono — idealmente vazia?</w:t>
       </w:r>
     </w:p>
@@ -1450,7 +1557,7 @@
         <w:t>PR-02 — Microcopy real.</w:t>
       </w:r>
       <w:r>
-        <w:t xml:space="preserve"> Labels, mensagens de erro, textos de botão e estados vazios escritos de forma clara e orientada à ação — os mesmos textos dos critérios (EN-06).</w:t>
+        <w:t xml:space="preserve"> Labels, mensagens de erro, textos de botão e estados vazios escritos de forma clara e orientada à ação — os mesmos textos da tabela de mensagens da história (EN-06).</w:t>
       </w:r>
     </w:p>
     <w:p>
@@ -1790,17 +1897,44 @@
         <w:t>desligado por padrão</w:t>
       </w:r>
       <w:r>
-        <w:t xml:space="preserve"> (tela limpa para validação com o negócio). Ligado: cada elemento rastreável (bloco, campo crítico, ação, mensagem, modal) exibe etiqueta com o critério que atende (ex.: </w:t>
+        <w:t xml:space="preserve"> (tela limpa para validação com o negócio). Ligado: cada elemento rastreável (bloco, campo crítico, ação, mensagem, modal) exibe etiqueta com a </w:t>
+      </w:r>
+      <w:r>
+        <w:rPr>
+          <w:b/>
+        </w:rPr>
+        <w:t>história</w:t>
+      </w:r>
+      <w:r>
+        <w:t xml:space="preserve"> que atende (ex.: </w:t>
       </w:r>
       <w:r>
         <w:rPr>
           <w:rFonts w:ascii="Courier New" w:hAnsi="Courier New"/>
           <w:sz w:val="19"/>
         </w:rPr>
-        <w:t>CRIT.M07.D01.02.04</w:t>
-      </w:r>
-      <w:r>
-        <w:t xml:space="preserve">) e a história de origem; ao apontar, mostra título e texto do critério; ao final da página, a matriz de rastreabilidade (critério → história → onde aparece). Desligado: a camada desaparece por completo. Granularidade: blocos, ações e campos críticos — sem poluir campo a campo (o detalhe vive no balão do critério de campos). </w:t>
+        <w:t>HIST.M16.D01.01</w:t>
+      </w:r>
+      <w:r>
+        <w:t xml:space="preserve">); ao apontar, mostra o </w:t>
+      </w:r>
+      <w:r>
+        <w:rPr>
+          <w:b/>
+        </w:rPr>
+        <w:t>texto do critério</w:t>
+      </w:r>
+      <w:r>
+        <w:t xml:space="preserve"> correspondente. Ao final da página, a matriz de rastreabilidade lista os critérios </w:t>
+      </w:r>
+      <w:r>
+        <w:rPr>
+          <w:b/>
+        </w:rPr>
+        <w:t>na ordem em que aparecem em cada história</w:t>
+      </w:r>
+      <w:r>
+        <w:t xml:space="preserve"> e onde cada um se materializa na tela — o ordinal exibido na matriz é recurso de navegação do protótipo, não numeração do documento (o documento de requisitos não numera critérios — EN-08). Desligado: a camada desaparece por completo. Granularidade: blocos, ações e campos críticos — sem poluir campo a campo (o detalhe vive no balão do critério de campos). </w:t>
       </w:r>
       <w:r>
         <w:rPr>

</xml_diff>